<commit_message>
Verify standalone study reproduction and publish calibration replay tools
</commit_message>
<xml_diff>
--- a/model/current_results/publication/documents/highlights.docx
+++ b/model/current_results/publication/documents/highlights.docx
@@ -7,7 +7,7 @@
         <w:pStyle w:val="ListBullet"/>
       </w:pPr>
       <w:r>
-        <w:t>Targeting retained 0.732 t ha⁻¹ yr⁻¹ more dry grain than uniform 50% cuts.</w:t>
+        <w:t>Irrigation cuts require balancing grain retention, water use and local losses.</w:t>
       </w:r>
     </w:p>
     <w:p>
@@ -15,7 +15,7 @@
         <w:pStyle w:val="ListBullet"/>
       </w:pPr>
       <w:r>
-        <w:t>The same irrigation budget produced 20.76 mm yr⁻¹ more simulated ET.</w:t>
+        <w:t>Targeting added 0.732 t ha⁻¹ dry grain and 20.76 mm ET yearly over uniform 50% cuts.</w:t>
       </w:r>
     </w:p>
     <w:p>

</xml_diff>